<commit_message>
feat: implement inline Universal Receipt Overlay Modal Popup across all operational dashboards
</commit_message>
<xml_diff>
--- a/HourWash_Flowchart.docx
+++ b/HourWash_Flowchart.docx
@@ -152,7 +152,7 @@
       <w:r>
         <w:drawing>
           <wp:inline xmlns:a="http://schemas.openxmlformats.org/drawingml/2006/main" xmlns:pic="http://schemas.openxmlformats.org/drawingml/2006/picture">
-            <wp:extent cx="5669280" cy="6688934"/>
+            <wp:extent cx="5943600" cy="7012592"/>
             <wp:docPr id="1" name="Picture 1"/>
             <wp:cNvGraphicFramePr>
               <a:graphicFrameLocks noChangeAspect="1"/>
@@ -173,7 +173,7 @@
                   <pic:spPr>
                     <a:xfrm>
                       <a:off x="0" y="0"/>
-                      <a:ext cx="5669280" cy="6688934"/>
+                      <a:ext cx="5943600" cy="7012592"/>
                     </a:xfrm>
                     <a:prstGeom prst="rect"/>
                   </pic:spPr>
@@ -228,7 +228,7 @@
       <w:r>
         <w:drawing>
           <wp:inline xmlns:a="http://schemas.openxmlformats.org/drawingml/2006/main" xmlns:pic="http://schemas.openxmlformats.org/drawingml/2006/picture">
-            <wp:extent cx="5669280" cy="6688934"/>
+            <wp:extent cx="5943600" cy="7012592"/>
             <wp:docPr id="2" name="Picture 2"/>
             <wp:cNvGraphicFramePr>
               <a:graphicFrameLocks noChangeAspect="1"/>
@@ -249,7 +249,7 @@
                   <pic:spPr>
                     <a:xfrm>
                       <a:off x="0" y="0"/>
-                      <a:ext cx="5669280" cy="6688934"/>
+                      <a:ext cx="5943600" cy="7012592"/>
                     </a:xfrm>
                     <a:prstGeom prst="rect"/>
                   </pic:spPr>
@@ -304,7 +304,7 @@
       <w:r>
         <w:drawing>
           <wp:inline xmlns:a="http://schemas.openxmlformats.org/drawingml/2006/main" xmlns:pic="http://schemas.openxmlformats.org/drawingml/2006/picture">
-            <wp:extent cx="5669280" cy="6688934"/>
+            <wp:extent cx="5943600" cy="7012592"/>
             <wp:docPr id="3" name="Picture 3"/>
             <wp:cNvGraphicFramePr>
               <a:graphicFrameLocks noChangeAspect="1"/>
@@ -325,7 +325,7 @@
                   <pic:spPr>
                     <a:xfrm>
                       <a:off x="0" y="0"/>
-                      <a:ext cx="5669280" cy="6688934"/>
+                      <a:ext cx="5943600" cy="7012592"/>
                     </a:xfrm>
                     <a:prstGeom prst="rect"/>
                   </pic:spPr>
@@ -380,7 +380,7 @@
       <w:r>
         <w:drawing>
           <wp:inline xmlns:a="http://schemas.openxmlformats.org/drawingml/2006/main" xmlns:pic="http://schemas.openxmlformats.org/drawingml/2006/picture">
-            <wp:extent cx="5669280" cy="6688934"/>
+            <wp:extent cx="5943600" cy="7012592"/>
             <wp:docPr id="4" name="Picture 4"/>
             <wp:cNvGraphicFramePr>
               <a:graphicFrameLocks noChangeAspect="1"/>
@@ -401,7 +401,7 @@
                   <pic:spPr>
                     <a:xfrm>
                       <a:off x="0" y="0"/>
-                      <a:ext cx="5669280" cy="6688934"/>
+                      <a:ext cx="5943600" cy="7012592"/>
                     </a:xfrm>
                     <a:prstGeom prst="rect"/>
                   </pic:spPr>
@@ -456,7 +456,7 @@
       <w:r>
         <w:drawing>
           <wp:inline xmlns:a="http://schemas.openxmlformats.org/drawingml/2006/main" xmlns:pic="http://schemas.openxmlformats.org/drawingml/2006/picture">
-            <wp:extent cx="5669280" cy="6688934"/>
+            <wp:extent cx="5943600" cy="7012592"/>
             <wp:docPr id="5" name="Picture 5"/>
             <wp:cNvGraphicFramePr>
               <a:graphicFrameLocks noChangeAspect="1"/>
@@ -477,7 +477,7 @@
                   <pic:spPr>
                     <a:xfrm>
                       <a:off x="0" y="0"/>
-                      <a:ext cx="5669280" cy="6688934"/>
+                      <a:ext cx="5943600" cy="7012592"/>
                     </a:xfrm>
                     <a:prstGeom prst="rect"/>
                   </pic:spPr>

</xml_diff>